<commit_message>
Use primary/supplementary branch terminology throughout
Chinese and English text, tables, captions, nomenclature and
Algorithm S1 updated; Fig. 3 redrawn and Fig. 2 panel titles relabelled.

Co-Authored-By: Claude Opus 5.5 <noreply@anthropic.com>
Claude-Session: https://claude.ai/code/session_011wQfVcjqSLDCo2NCokAy4g
</commit_message>
<xml_diff>
--- a/01_投稿稿件_英文/补充材料_Supplementary.docx
+++ b/01_投稿稿件_英文/补充材料_Supplementary.docx
@@ -10258,7 +10258,7 @@
         <w:pStyle w:val="FirstParagraph"/>
       </w:pPr>
       <w:r>
-        <w:t xml:space="preserve">Holm correction was applied within the following prespecified families at α = 0.05: (1) the 14 encoder pairings versus MLP + CNN; (2) the five waveform complements versus A2; (3) the confirmatory ablations R0 − A1, R0 − A2, R0 − A3 and A3 − A4; (4) the three patch configurations versus R0; (5) the three adaptation ablations versus R0; (6) the six feature-count levels versus</w:t>
+        <w:t xml:space="preserve">Holm correction was applied within the following prespecified families at α = 0.05: (1) the 14 encoder pairings versus MLP + CNN; (2) the five supplementary waveform branches versus A2; (3) the confirmatory ablations R0 − A1, R0 − A2, R0 − A3 and A3 − A4; (4) the three patch configurations versus R0; (5) the three adaptation ablations versus R0; (6) the six feature-count levels versus</w:t>
       </w:r>
       <w:r>
         <w:t xml:space="preserve"> </w:t>
@@ -10445,7 +10445,7 @@
         <w:t xml:space="preserve"> </w:t>
       </w:r>
       <w:r>
-        <w:t xml:space="preserve">= 0.90). Diagnostics trace the difference to the backbone features. The re-implementation computes its features on the absolute voltage and, on NMC, selects absolute-level features such as the pre-pulse and final voltages and voltage quantiles (six in fold 0, almost none on LFP). Because the NMC open-circuit voltage is sloped and capacity fade shifts the actual SOC of each pulse, the pre-pulse voltage tracks SOH (mean absolute Spearman correlation 0.93, LFP 0.36) and predicts the actual SOC deviation with</w:t>
+        <w:t xml:space="preserve">= 0.90). Diagnostics trace the difference to the primary branch features. The re-implementation computes its features on the absolute voltage and, on NMC, selects absolute-level features such as the pre-pulse and final voltages and voltage quantiles (six in fold 0, almost none on LFP). Because the NMC open-circuit voltage is sloped and capacity fade shifts the actual SOC of each pulse, the pre-pulse voltage tracks SOH (mean absolute Spearman correlation 0.93, LFP 0.36) and predicts the actual SOC deviation with</w:t>
       </w:r>
       <w:r>
         <w:t xml:space="preserve"> </w:t>
@@ -10458,7 +10458,7 @@
         <w:t xml:space="preserve">R</w:t>
       </w:r>
       <w:r>
-        <w:t xml:space="preserve">² = 0.964 (LFP 0.489). Once the backbone holds this information, the dynamic information of the waveform branch partly overlaps with it: within each pulse condition the selected features explain 99.4% of the variance of the first ten principal components of ΔV (LFP 18.3%). With the 28 absolute-level features removed from the candidates, the re-implementation gives A2 2.098 pp, R0 1.940 pp and R0 − A2 = −0.158 pp (−0.205 to −0.112,</w:t>
+        <w:t xml:space="preserve">² = 0.964 (LFP 0.489). Once the primary branch holds this information, the dynamic information of the waveform branch partly overlaps with it: within each pulse condition the selected features explain 99.4% of the variance of the first ten principal components of ΔV (LFP 18.3%). With the 28 absolute-level features removed from the candidates, the re-implementation gives A2 2.098 pp, R0 1.940 pp and R0 − A2 = −0.158 pp (−0.205 to −0.112,</w:t>
       </w:r>
       <w:r>
         <w:t xml:space="preserve"> </w:t>
@@ -10549,7 +10549,7 @@
         <w:t xml:space="preserve"> </w:t>
       </w:r>
       <w:r>
-        <w:t xml:space="preserve">Training and inference of the dual-branch SOH estimation model (handcrafted backbone + pulse-waveform complement).</w:t>
+        <w:t xml:space="preserve">Training and inference of the dual-branch SOH estimation model (handcrafted primary branch + supplementary pulse-waveform branch).</w:t>
       </w:r>
     </w:p>
     <w:p>
@@ -13039,7 +13039,7 @@
                 <w:b/>
                 <w:noProof/>
               </w:rPr>
-              <w:t xml:space="preserve">Backbone branch</w:t>
+              <w:t xml:space="preserve">Primary branch</w:t>
             </w:r>
           </w:p>
         </w:tc>
@@ -13868,7 +13868,7 @@
                 <w:b/>
                 <w:noProof/>
               </w:rPr>
-              <w:t xml:space="preserve">Handcrafted backbone</w:t>
+              <w:t xml:space="preserve">Handcrafted primary branch</w:t>
             </w:r>
           </w:p>
         </w:tc>
@@ -13890,7 +13890,7 @@
                 <w:b/>
                 <w:noProof/>
               </w:rPr>
-              <w:t xml:space="preserve">Waveform complement</w:t>
+              <w:t xml:space="preserve">Supplementary waveform branch</w:t>
             </w:r>
           </w:p>
         </w:tc>
@@ -18073,7 +18073,7 @@
                 <w:b/>
                 <w:noProof/>
               </w:rPr>
-              <w:t xml:space="preserve">Backbone input</w:t>
+              <w:t xml:space="preserve">Primary-branch input</w:t>
             </w:r>
           </w:p>
         </w:tc>
@@ -19457,7 +19457,7 @@
         <w:t xml:space="preserve"> </w:t>
       </w:r>
       <w:r>
-        <w:t xml:space="preserve">excludes the separately appended cycle count, so the backbone input has</w:t>
+        <w:t xml:space="preserve">excludes the separately appended cycle count, so the primary branch input has</w:t>
       </w:r>
       <w:r>
         <w:t xml:space="preserve"> </w:t>
@@ -21521,7 +21521,7 @@
               <w:rPr>
                 <w:noProof/>
               </w:rPr>
-              <w:t xml:space="preserve">Five-fold, re-implementation, backbone without absolute-level features</w:t>
+              <w:t xml:space="preserve">Five-fold, re-implementation, primary branch without absolute-level features</w:t>
             </w:r>
           </w:p>
         </w:tc>
@@ -21765,7 +21765,7 @@
               <a:graphicData uri="http://schemas.openxmlformats.org/drawingml/2006/picture">
                 <pic:pic>
                   <pic:nvPicPr>
-                    <pic:cNvPr descr="figures/figS1_patch_cdf.png" id="28" name="Picture"/>
+                    <pic:cNvPr descr="04_图片/figS1_patch_cdf.png" id="28" name="Picture"/>
                     <pic:cNvPicPr>
                       <a:picLocks noChangeArrowheads="1" noChangeAspect="1"/>
                     </pic:cNvPicPr>
@@ -21830,7 +21830,7 @@
               <a:graphicData uri="http://schemas.openxmlformats.org/drawingml/2006/picture">
                 <pic:pic>
                   <pic:nvPicPr>
-                    <pic:cNvPr descr="figures/figS2_K.png" id="31" name="Picture"/>
+                    <pic:cNvPr descr="04_图片/figS2_K.png" id="31" name="Picture"/>
                     <pic:cNvPicPr>
                       <a:picLocks noChangeArrowheads="1" noChangeAspect="1"/>
                     </pic:cNvPicPr>
@@ -21924,7 +21924,7 @@
               <a:graphicData uri="http://schemas.openxmlformats.org/drawingml/2006/picture">
                 <pic:pic>
                   <pic:nvPicPr>
-                    <pic:cNvPr descr="figures/figS3_bias_soh.png" id="34" name="Picture"/>
+                    <pic:cNvPr descr="04_图片/figS3_bias_soh.png" id="34" name="Picture"/>
                     <pic:cNvPicPr>
                       <a:picLocks noChangeArrowheads="1" noChangeAspect="1"/>
                     </pic:cNvPicPr>
@@ -21989,7 +21989,7 @@
               <a:graphicData uri="http://schemas.openxmlformats.org/drawingml/2006/picture">
                 <pic:pic>
                   <pic:nvPicPr>
-                    <pic:cNvPr descr="figures/figS4_cells.png" id="37" name="Picture"/>
+                    <pic:cNvPr descr="04_图片/figS4_cells.png" id="37" name="Picture"/>
                     <pic:cNvPicPr>
                       <a:picLocks noChangeArrowheads="1" noChangeAspect="1"/>
                     </pic:cNvPicPr>
@@ -22054,7 +22054,7 @@
               <a:graphicData uri="http://schemas.openxmlformats.org/drawingml/2006/picture">
                 <pic:pic>
                   <pic:nvPicPr>
-                    <pic:cNvPr descr="figures/figS5_groups.png" id="40" name="Picture"/>
+                    <pic:cNvPr descr="04_图片/figS5_groups.png" id="40" name="Picture"/>
                     <pic:cNvPicPr>
                       <a:picLocks noChangeArrowheads="1" noChangeAspect="1"/>
                     </pic:cNvPicPr>

</xml_diff>

<commit_message>
Replace re-implementation results with original-code results
Section 4.6, Table 9, Fig. 7, conclusions, abstract and Supplementary
Note S4 / Table S6 now use the locally rerun original implementation;
add NMC encoder matrix (Table S7) and redrawn Fig. S3 (R0 vs A2).
Chinese version, change log and README updated accordingly.

Co-Authored-By: Claude Opus 5.5 <noreply@anthropic.com>
Claude-Session: https://claude.ai/code/session_011wQfVcjqSLDCo2NCokAy4g
</commit_message>
<xml_diff>
--- a/01_投稿稿件_英文/补充材料_Supplementary.docx
+++ b/01_投稿稿件_英文/补充材料_Supplementary.docx
@@ -111,7 +111,7 @@
         <w:pStyle w:val="ContentsEntry"/>
       </w:pPr>
       <w:r>
-        <w:t xml:space="preserve">Supplementary Note S4. Re-implementation used for the generalisation, robustness and deployment experiments</w:t>
+        <w:t xml:space="preserve">Supplementary Note S4. Procedures of the generalisation, robustness and deployment experiments</w:t>
       </w:r>
     </w:p>
     <w:p>
@@ -119,7 +119,7 @@
         <w:pStyle w:val="ContentsEntry"/>
       </w:pPr>
       <w:r>
-        <w:t xml:space="preserve">Supplementary Algorithm S1; Supplementary Tables S1–S6; Supplementary Figs. S1–S5</w:t>
+        <w:t xml:space="preserve">Supplementary Algorithm S1; Supplementary Tables S1–S7; Supplementary Figs. S1–S5</w:t>
       </w:r>
     </w:p>
     <w:bookmarkStart w:id="20" w:name="X2cf1acafb4642dc5494b63a6864f0c11d2d5b87"/>
@@ -137,7 +137,7 @@
         <w:pStyle w:val="FirstParagraph"/>
       </w:pPr>
       <w:r>
-        <w:t xml:space="preserve">This note defines the 143 waveform-derived features of Table 2; the seven context quantities are given in Eq. (3) of the main text. The segments follow the publisher’s pulse timing and are defined, together with the first and second differences, as</w:t>
+        <w:t xml:space="preserve">This note defines the 143 waveform-derived features of Table 2; the seven context quantities are given in Eq. (3) of the main text. All features are computed on the absolute terminal voltage; only the supplementary branch receives the first-sample-referenced ΔV. The segments follow the publisher’s pulse timing and are defined, together with the first and second differences, as</w:t>
       </w:r>
     </w:p>
     <w:p>
@@ -10294,13 +10294,13 @@
       </w:r>
     </w:p>
     <w:bookmarkEnd w:id="22"/>
-    <w:bookmarkStart w:id="23" w:name="X5d92bacdf4c9a455137fea0cbf4e38cd4e3e219"/>
+    <w:bookmarkStart w:id="23" w:name="X09f4919479a5a01c47a41970df28dbbc7f913d7"/>
     <w:p>
       <w:pPr>
         <w:pStyle w:val="Heading1"/>
       </w:pPr>
       <w:r>
-        <w:t xml:space="preserve">Supplementary Note S4. Re-implementation used for the generalisation, robustness and deployment experiments</w:t>
+        <w:t xml:space="preserve">Supplementary Note S4. Procedures of the generalisation, robustness and deployment experiments</w:t>
       </w:r>
     </w:p>
     <w:p>
@@ -10308,7 +10308,33 @@
         <w:pStyle w:val="FirstParagraph"/>
       </w:pPr>
       <w:r>
-        <w:t xml:space="preserve">Apart from the main NMC/graphite results, the experiments of Section 4.6 were run with an independent re-implementation of the protocol written in Python (NumPy, scikit-learn 1.9 and PyTorch 2.14 on CPU, one thread per run), starting from the publisher’s processed pulse files [31]. Cleaning reproduced the record counts exactly: 17,130 records in 2,855 groups before cleaning, 192 records removed at the 42nd RPT, and 16,938 records in 2,823 complete groups (SOH 72.34–100%) after cleaning. The 143 waveform features were implemented from the definitions in Supplementary Note S1; details not fixed by those definitions, such as the quantile levels of the global family and the nine voltage differences not listed in Note S1, may differ from the original code, and the response-time levels were set to 0.5, 0.632 and 0.9. Feature selection was nonetheless similar: in fold 0 it selected 16 frequency and wavelet, 14 segment, 11 difference-dynamics, 6 global, 1 boundary and 1 nonlinear feature together with the DCIR, which ranked 13th; 44 features were selected in every fold and 57 in at least one. The split permutation used NumPy’s default generator with seed 42, which reproduces the fold sizes but not necessarily the fold membership of the original runs. Architectures, loss, optimiser, scheduler, early stopping and seeds follow Sections 3.2–3.4 of the main text, with positional embeddings initialised from U(−0.02, 0.02).</w:t>
+        <w:t xml:space="preserve">All experiments of Section 4.6 use the original implementation: the training loops, feature extraction, cleaning, Top-</w:t>
+      </w:r>
+      <w:r>
+        <w:rPr>
+          <w:i/>
+          <w:iCs/>
+        </w:rPr>
+        <w:t xml:space="preserve">K</w:t>
+      </w:r>
+      <w:r>
+        <w:t xml:space="preserve"> </w:t>
+      </w:r>
+      <w:r>
+        <w:t xml:space="preserve">selection, fold split (seed 42) and initialisation seeds (0, 1, 2) of the main results, with Top-</w:t>
+      </w:r>
+      <w:r>
+        <w:rPr>
+          <w:i/>
+          <w:iCs/>
+        </w:rPr>
+        <w:t xml:space="preserve">K</w:t>
+      </w:r>
+      <w:r>
+        <w:t xml:space="preserve"> </w:t>
+      </w:r>
+      <w:r>
+        <w:t xml:space="preserve">selection, imputation and standardisation fitted on the training cells of each split. Table S6 lists all results.</w:t>
       </w:r>
     </w:p>
     <w:p>
@@ -10316,23 +10342,17 @@
         <w:pStyle w:val="BodyText"/>
       </w:pPr>
       <w:r>
-        <w:t xml:space="preserve">Under the original five-fold protocol the re-implementation gives R0 1.427 and A2 1.474 pp (reported: 1.377 and 1.500 pp). The waveform increment keeps its sign and significance (−0.046 pp, −0.070 to −0.023;</w:t>
-      </w:r>
-      <w:r>
-        <w:t xml:space="preserve"> </w:t>
-      </w:r>
-      <w:r>
         <w:rPr>
           <w:i/>
           <w:iCs/>
         </w:rPr>
-        <w:t xml:space="preserve">p</w:t>
+        <w:t xml:space="preserve">Leave-one-group-out.</w:t>
       </w:r>
       <w:r>
         <w:t xml:space="preserve"> </w:t>
       </w:r>
       <w:r>
-        <w:t xml:space="preserve">&lt; 0.001; 42 of 64 cells), and cells 12 and 3 are again the best- and worst-estimated cells. Table S6 lists all re-implementation results.</w:t>
+        <w:t xml:space="preserve">Each of the 11 cycling groups is held out in turn as the test set (six cells; four for group 11). One randomly drawn cell from each of the other ten groups (random seed 42 + group index) forms the validation set, and the remaining 48 cells (50 when group 11 is held out) form the training set. The bootstrap is stratified by held-out group.</w:t>
       </w:r>
     </w:p>
     <w:p>
@@ -10344,16 +10364,43 @@
           <w:i/>
           <w:iCs/>
         </w:rPr>
-        <w:t xml:space="preserve">NMC/graphite dataset.</w:t>
+        <w:t xml:space="preserve">Cycle-count errors.</w:t>
       </w:r>
       <w:r>
         <w:t xml:space="preserve"> </w:t>
       </w:r>
       <w:r>
-        <w:t xml:space="preserve">The UConn-ILCC NMC dataset [31] records the same 100-s pulses at nine nominal SOCs; the three SOCs used for LFP (20%, 50% and 90%) were retained, giving six conditions per RPT, 8,016 records in 1,336 cell–RPT groups of 44 cells and SOH from 41.2% to 100%. Because NMC cells have a higher resistance, the voltage-step and range limits of Eq. (2) were relaxed to 0.3 and 0.8 V; no record was removed. The main-text results come from the original implementation (five folds × three seeds,</w:t>
+        <w:t xml:space="preserve">The cycle count of the test records is multiplied by 1.1 or 0.9, and the models trained on correct counts are evaluated unchanged.</w:t>
+      </w:r>
+    </w:p>
+    <w:p>
+      <w:pPr>
+        <w:pStyle w:val="BodyText"/>
+      </w:pPr>
+      <w:r>
+        <w:rPr>
+          <w:i/>
+          <w:iCs/>
+        </w:rPr>
+        <w:t xml:space="preserve">Sensor noise.</w:t>
       </w:r>
       <w:r>
         <w:t xml:space="preserve"> </w:t>
+      </w:r>
+      <w:r>
+        <w:t xml:space="preserve">Gaussian noise with σ</w:t>
+      </w:r>
+      <w:r>
+        <w:rPr>
+          <w:vertAlign w:val="subscript"/>
+        </w:rPr>
+        <w:t xml:space="preserve">noise</w:t>
+      </w:r>
+      <w:r>
+        <w:t xml:space="preserve"> </w:t>
+      </w:r>
+      <w:r>
+        <w:t xml:space="preserve">= 1 or 2 mV is added to the raw 101-point voltage of all 17,130 records, with one fixed noise realisation per level shared by R0 and A2. The 150 features are re-extracted from the noisy voltages, the DCIR context column is recomputed from the noisy pulse with the publisher’s formula, and Top-</w:t>
       </w:r>
       <w:r>
         <w:rPr>
@@ -10366,6 +10413,100 @@
         <w:t xml:space="preserve"> </w:t>
       </w:r>
       <w:r>
+        <w:t xml:space="preserve">selection is refitted on the noisy training data. Cleaning is not repeated, so that the 16,938 records remain paired with the clean experiment (σ</w:t>
+      </w:r>
+      <w:r>
+        <w:rPr>
+          <w:vertAlign w:val="subscript"/>
+        </w:rPr>
+        <w:t xml:space="preserve">noise</w:t>
+      </w:r>
+      <w:r>
+        <w:t xml:space="preserve"> </w:t>
+      </w:r>
+      <w:r>
+        <w:t xml:space="preserve">≤ 2 mV is far below the cleaning thresholds). When noise of σ</w:t>
+      </w:r>
+      <w:r>
+        <w:rPr>
+          <w:vertAlign w:val="subscript"/>
+        </w:rPr>
+        <w:t xml:space="preserve">noise</w:t>
+      </w:r>
+      <w:r>
+        <w:t xml:space="preserve"> </w:t>
+      </w:r>
+      <w:r>
+        <w:t xml:space="preserve">= 0.5 mV is added only to the test voltages of models trained on clean data, both models deteriorate strongly (R0 3.958 pp, A2 4.339 pp), because difference- and spectrum-based features are sensitive to noise absent from training; models should therefore be trained on data from the target sensor, or with matching noise augmentation as above.</w:t>
+      </w:r>
+    </w:p>
+    <w:p>
+      <w:pPr>
+        <w:pStyle w:val="BodyText"/>
+      </w:pPr>
+      <w:r>
+        <w:rPr>
+          <w:i/>
+          <w:iCs/>
+        </w:rPr>
+        <w:t xml:space="preserve">Number of pulses.</w:t>
+      </w:r>
+      <w:r>
+        <w:t xml:space="preserve"> </w:t>
+      </w:r>
+      <w:r>
+        <w:t xml:space="preserve">The models trained on all six pulses are kept unchanged. For each of the 63 non-empty subsets of the six pulse conditions, the predictions and the measured SOH are averaged over the pulses of the subset within each cell–RPT, and the cell-macro RMSE of Eq. (14) is computed; every subset contains at least one pulse in every cell–RPT. The three discharge pulses give R0 1.415 pp and A2 1.531 pp.</w:t>
+      </w:r>
+    </w:p>
+    <w:p>
+      <w:pPr>
+        <w:pStyle w:val="BodyText"/>
+      </w:pPr>
+      <w:r>
+        <w:rPr>
+          <w:i/>
+          <w:iCs/>
+        </w:rPr>
+        <w:t xml:space="preserve">Attribution and cost.</w:t>
+      </w:r>
+      <w:r>
+        <w:t xml:space="preserve"> </w:t>
+      </w:r>
+      <w:r>
+        <w:t xml:space="preserve">Integrated gradients use an all-zero standardised waveform as the baseline and 32 midpoint integration steps over the waveform input of the 15 R0 models, with the handcrafted features and the cycle count held at their measured values; attributions are converted to SOH percentage points. Parameters and FLOPs (matrix multiplications, convolutions and attention, two FLOPs per multiply–add) are counted with PyTorch; latency is the median of 1,000 single-thread, batch-one forward passes on an AMD Ryzen 9 8945HX CPU after 50 warm-up passes, and feature time is that of the original extraction script on one thread.</w:t>
+      </w:r>
+    </w:p>
+    <w:p>
+      <w:pPr>
+        <w:pStyle w:val="BodyText"/>
+      </w:pPr>
+      <w:r>
+        <w:rPr>
+          <w:i/>
+          <w:iCs/>
+        </w:rPr>
+        <w:t xml:space="preserve">NMC/graphite dataset.</w:t>
+      </w:r>
+      <w:r>
+        <w:t xml:space="preserve"> </w:t>
+      </w:r>
+      <w:r>
+        <w:t xml:space="preserve">The UConn-ILCC NMC dataset [31] records the same 100-s pulses at nine nominal SOCs; the three SOCs used for LFP (20%, 50% and 90%) were retained, giving six conditions per RPT, 8,016 records in 1,336 cell–RPT groups of 44 cells and SOH from 41.2% to 100%. Because NMC cells have a higher resistance, the voltage-step and range limits of Eq. (2) were relaxed to 0.3 and 0.8 V; no record was removed. Training follows the LFP protocol (five folds × three seeds,</w:t>
+      </w:r>
+      <w:r>
+        <w:t xml:space="preserve"> </w:t>
+      </w:r>
+      <w:r>
+        <w:rPr>
+          <w:i/>
+          <w:iCs/>
+        </w:rPr>
+        <w:t xml:space="preserve">K</w:t>
+      </w:r>
+      <w:r>
+        <w:t xml:space="preserve"> </w:t>
+      </w:r>
+      <w:r>
         <w:t xml:space="preserve">= 50,</w:t>
       </w:r>
       <w:r>
@@ -10382,23 +10523,7 @@
         <w:t xml:space="preserve"> </w:t>
       </w:r>
       <w:r>
-        <w:t xml:space="preserve">= 0.1, as for LFP): R0 1.968 pp, A2 2.132 pp, R0 − A2 = −0.163 pp (Holm-adjusted</w:t>
-      </w:r>
-      <w:r>
-        <w:t xml:space="preserve"> </w:t>
-      </w:r>
-      <w:r>
-        <w:rPr>
-          <w:i/>
-          <w:iCs/>
-        </w:rPr>
-        <w:t xml:space="preserve">p</w:t>
-      </w:r>
-      <w:r>
-        <w:t xml:space="preserve"> </w:t>
-      </w:r>
-      <w:r>
-        <w:t xml:space="preserve">= 0.0004, 39/44) and A1 2.468 pp. The DCIR correlates strongly with SOH (</w:t>
+        <w:t xml:space="preserve">= 0.1). The DCIR correlates strongly with SOH (</w:t>
       </w:r>
       <w:r>
         <w:rPr>
@@ -10411,116 +10536,7 @@
         <w:t xml:space="preserve"> </w:t>
       </w:r>
       <w:r>
-        <w:t xml:space="preserve">≈ −0.82) but entered none of the 50 selected features because it is redundant with selected waveform features, so it was added to the A1 input separately, as the definition of A1 requires; R0 and A2 were run unchanged.</w:t>
-      </w:r>
-    </w:p>
-    <w:p>
-      <w:pPr>
-        <w:pStyle w:val="BodyText"/>
-      </w:pPr>
-      <w:r>
-        <w:rPr>
-          <w:i/>
-          <w:iCs/>
-        </w:rPr>
-        <w:t xml:space="preserve">Difference between the re-implementation and the original implementation.</w:t>
-      </w:r>
-      <w:r>
-        <w:t xml:space="preserve"> </w:t>
-      </w:r>
-      <w:r>
-        <w:t xml:space="preserve">The re-implementation found no waveform increment on NMC (R0 2.030 pp, A2 2.026 pp, R0 − A2 = +0.004 pp,</w:t>
-      </w:r>
-      <w:r>
-        <w:t xml:space="preserve"> </w:t>
-      </w:r>
-      <w:r>
-        <w:rPr>
-          <w:i/>
-          <w:iCs/>
-        </w:rPr>
-        <w:t xml:space="preserve">p</w:t>
-      </w:r>
-      <w:r>
-        <w:t xml:space="preserve"> </w:t>
-      </w:r>
-      <w:r>
-        <w:t xml:space="preserve">= 0.90). Diagnostics trace the difference to the primary branch features. The re-implementation computes its features on the absolute voltage and, on NMC, selects absolute-level features such as the pre-pulse and final voltages and voltage quantiles (six in fold 0, almost none on LFP). Because the NMC open-circuit voltage is sloped and capacity fade shifts the actual SOC of each pulse, the pre-pulse voltage tracks SOH (mean absolute Spearman correlation 0.93, LFP 0.36) and predicts the actual SOC deviation with</w:t>
-      </w:r>
-      <w:r>
-        <w:t xml:space="preserve"> </w:t>
-      </w:r>
-      <w:r>
-        <w:rPr>
-          <w:i/>
-          <w:iCs/>
-        </w:rPr>
-        <w:t xml:space="preserve">R</w:t>
-      </w:r>
-      <w:r>
-        <w:t xml:space="preserve">² = 0.964 (LFP 0.489). Once the primary branch holds this information, the dynamic information of the waveform branch partly overlaps with it: within each pulse condition the selected features explain 99.4% of the variance of the first ten principal components of ΔV (LFP 18.3%). With the 28 absolute-level features removed from the candidates, the re-implementation gives A2 2.098 pp, R0 1.940 pp and R0 − A2 = −0.158 pp (−0.205 to −0.112,</w:t>
-      </w:r>
-      <w:r>
-        <w:t xml:space="preserve"> </w:t>
-      </w:r>
-      <w:r>
-        <w:rPr>
-          <w:i/>
-          <w:iCs/>
-        </w:rPr>
-        <w:t xml:space="preserve">p</w:t>
-      </w:r>
-      <w:r>
-        <w:t xml:space="preserve"> </w:t>
-      </w:r>
-      <w:r>
-        <w:t xml:space="preserve">&lt; 0.001, 36/44), consistent with the original implementation. Using all nine SOCs (24,048 records) does not change the re-implementation result (R0 − A2 = +0.017 pp,</w:t>
-      </w:r>
-      <w:r>
-        <w:t xml:space="preserve"> </w:t>
-      </w:r>
-      <w:r>
-        <w:rPr>
-          <w:i/>
-          <w:iCs/>
-        </w:rPr>
-        <w:t xml:space="preserve">p</w:t>
-      </w:r>
-      <w:r>
-        <w:t xml:space="preserve"> </w:t>
-      </w:r>
-      <w:r>
-        <w:t xml:space="preserve">= 0.67), so the difference is not a matter of data volume.</w:t>
-      </w:r>
-    </w:p>
-    <w:p>
-      <w:pPr>
-        <w:pStyle w:val="BodyText"/>
-      </w:pPr>
-      <w:r>
-        <w:rPr>
-          <w:i/>
-          <w:iCs/>
-        </w:rPr>
-        <w:t xml:space="preserve">Noise not seen in training.</w:t>
-      </w:r>
-      <w:r>
-        <w:t xml:space="preserve"> </w:t>
-      </w:r>
-      <w:r>
-        <w:t xml:space="preserve">When Gaussian noise is added only to the test voltages of models trained on clean data, both neural models deteriorate strongly (σ</w:t>
-      </w:r>
-      <w:r>
-        <w:rPr>
-          <w:vertAlign w:val="subscript"/>
-        </w:rPr>
-        <w:t xml:space="preserve">noise</w:t>
-      </w:r>
-      <w:r>
-        <w:t xml:space="preserve"> </w:t>
-      </w:r>
-      <w:r>
-        <w:t xml:space="preserve">= 0.5 mV: R0 4.37, A2 4.60 pp), because difference- and spectrum-based features computed on the smooth, 0.1-mV-resolution resampled records are sensitive to noise absent from training. Models should therefore be trained on data from the target sensor, or with matching noise augmentation, as in the matched-noise experiment of Section 4.6.</w:t>
+        <w:t xml:space="preserve">≈ −0.82) but entered none of the 50 selected features because it is redundant with selected waveform features, so it was added to the A1 input separately, as the definition of A1 requires; R0 and A2 were run unchanged. In every fold the Top-50 set contains six absolute-level features (the pre-pulse, final, minimum and mean voltages of the pulse and the minimum and maximum of the second segment), ranked 31st to 41st. The 3 × 5 encoder matrix (Table S7) uses the same data and splits, with the 15 runs of R0 shared with the main NMC result.</w:t>
       </w:r>
     </w:p>
     <w:bookmarkEnd w:id="23"/>
@@ -19771,7 +19787,7 @@
               <w:rPr>
                 <w:noProof/>
               </w:rPr>
-              <w:t xml:space="preserve">Five-fold, reported (main text)</w:t>
+              <w:t xml:space="preserve">Five-fold (main text)</w:t>
             </w:r>
           </w:p>
         </w:tc>
@@ -19938,7 +19954,7 @@
               <w:rPr>
                 <w:noProof/>
               </w:rPr>
-              <w:t xml:space="preserve">Five-fold, re-implementation</w:t>
+              <w:t xml:space="preserve">Leave-one-group-out</w:t>
             </w:r>
           </w:p>
         </w:tc>
@@ -19974,25 +19990,25 @@
               <w:rPr>
                 <w:noProof/>
               </w:rPr>
-              <w:t xml:space="preserve">1.427</w:t>
-            </w:r>
-          </w:p>
-        </w:tc>
-        <w:tc>
-          <w:tcPr>
-            <w:tcBorders/>
-            <w:vAlign w:val="center"/>
-          </w:tcPr>
-          <w:p>
-            <w:pPr>
-              <w:pStyle w:val="TableText"/>
-              <w:jc w:val="right"/>
-            </w:pPr>
-            <w:r>
-              <w:rPr>
-                <w:noProof/>
-              </w:rPr>
-              <w:t xml:space="preserve">1.474</w:t>
+              <w:t xml:space="preserve">1.520</w:t>
+            </w:r>
+          </w:p>
+        </w:tc>
+        <w:tc>
+          <w:tcPr>
+            <w:tcBorders/>
+            <w:vAlign w:val="center"/>
+          </w:tcPr>
+          <w:p>
+            <w:pPr>
+              <w:pStyle w:val="TableText"/>
+              <w:jc w:val="right"/>
+            </w:pPr>
+            <w:r>
+              <w:rPr>
+                <w:noProof/>
+              </w:rPr>
+              <w:t xml:space="preserve">1.611</w:t>
             </w:r>
           </w:p>
         </w:tc>
@@ -20028,7 +20044,7 @@
               <w:rPr>
                 <w:noProof/>
               </w:rPr>
-              <w:t xml:space="preserve">−0.046</w:t>
+              <w:t xml:space="preserve">−0.090</w:t>
             </w:r>
           </w:p>
         </w:tc>
@@ -20046,7 +20062,7 @@
               <w:rPr>
                 <w:noProof/>
               </w:rPr>
-              <w:t xml:space="preserve">−0.070 to −0.023</w:t>
+              <w:t xml:space="preserve">−0.105 to −0.075</w:t>
             </w:r>
           </w:p>
         </w:tc>
@@ -20082,7 +20098,7 @@
               <w:rPr>
                 <w:noProof/>
               </w:rPr>
-              <w:t xml:space="preserve">42/64</w:t>
+              <w:t xml:space="preserve">53/64</w:t>
             </w:r>
           </w:p>
         </w:tc>
@@ -20105,7 +20121,7 @@
               <w:rPr>
                 <w:noProof/>
               </w:rPr>
-              <w:t xml:space="preserve">Leave-one-group-out</w:t>
+              <w:t xml:space="preserve">Cycle count +10% (test)</w:t>
             </w:r>
           </w:p>
         </w:tc>
@@ -20141,25 +20157,25 @@
               <w:rPr>
                 <w:noProof/>
               </w:rPr>
-              <w:t xml:space="preserve">1.560</w:t>
-            </w:r>
-          </w:p>
-        </w:tc>
-        <w:tc>
-          <w:tcPr>
-            <w:tcBorders/>
-            <w:vAlign w:val="center"/>
-          </w:tcPr>
-          <w:p>
-            <w:pPr>
-              <w:pStyle w:val="TableText"/>
-              <w:jc w:val="right"/>
-            </w:pPr>
-            <w:r>
-              <w:rPr>
-                <w:noProof/>
-              </w:rPr>
-              <w:t xml:space="preserve">1.594</w:t>
+              <w:t xml:space="preserve">1.411</w:t>
+            </w:r>
+          </w:p>
+        </w:tc>
+        <w:tc>
+          <w:tcPr>
+            <w:tcBorders/>
+            <w:vAlign w:val="center"/>
+          </w:tcPr>
+          <w:p>
+            <w:pPr>
+              <w:pStyle w:val="TableText"/>
+              <w:jc w:val="right"/>
+            </w:pPr>
+            <w:r>
+              <w:rPr>
+                <w:noProof/>
+              </w:rPr>
+              <w:t xml:space="preserve">1.527</w:t>
             </w:r>
           </w:p>
         </w:tc>
@@ -20195,7 +20211,7 @@
               <w:rPr>
                 <w:noProof/>
               </w:rPr>
-              <w:t xml:space="preserve">−0.035</w:t>
+              <w:t xml:space="preserve">−0.117</w:t>
             </w:r>
           </w:p>
         </w:tc>
@@ -20213,43 +20229,43 @@
               <w:rPr>
                 <w:noProof/>
               </w:rPr>
-              <w:t xml:space="preserve">−0.053 to −0.015</w:t>
-            </w:r>
-          </w:p>
-        </w:tc>
-        <w:tc>
-          <w:tcPr>
-            <w:tcBorders/>
-            <w:vAlign w:val="center"/>
-          </w:tcPr>
-          <w:p>
-            <w:pPr>
-              <w:pStyle w:val="TableText"/>
-              <w:jc w:val="right"/>
-            </w:pPr>
-            <w:r>
-              <w:rPr>
-                <w:noProof/>
-              </w:rPr>
-              <w:t xml:space="preserve">0.008</w:t>
-            </w:r>
-          </w:p>
-        </w:tc>
-        <w:tc>
-          <w:tcPr>
-            <w:tcBorders/>
-            <w:vAlign w:val="center"/>
-          </w:tcPr>
-          <w:p>
-            <w:pPr>
-              <w:pStyle w:val="TableText"/>
-              <w:jc w:val="right"/>
-            </w:pPr>
-            <w:r>
-              <w:rPr>
-                <w:noProof/>
-              </w:rPr>
-              <w:t xml:space="preserve">39/64</w:t>
+              <w:t xml:space="preserve">−0.136 to −0.096</w:t>
+            </w:r>
+          </w:p>
+        </w:tc>
+        <w:tc>
+          <w:tcPr>
+            <w:tcBorders/>
+            <w:vAlign w:val="center"/>
+          </w:tcPr>
+          <w:p>
+            <w:pPr>
+              <w:pStyle w:val="TableText"/>
+              <w:jc w:val="right"/>
+            </w:pPr>
+            <w:r>
+              <w:rPr>
+                <w:noProof/>
+              </w:rPr>
+              <w:t xml:space="preserve">&lt;0.001</w:t>
+            </w:r>
+          </w:p>
+        </w:tc>
+        <w:tc>
+          <w:tcPr>
+            <w:tcBorders/>
+            <w:vAlign w:val="center"/>
+          </w:tcPr>
+          <w:p>
+            <w:pPr>
+              <w:pStyle w:val="TableText"/>
+              <w:jc w:val="right"/>
+            </w:pPr>
+            <w:r>
+              <w:rPr>
+                <w:noProof/>
+              </w:rPr>
+              <w:t xml:space="preserve">57/64</w:t>
             </w:r>
           </w:p>
         </w:tc>
@@ -20272,7 +20288,7 @@
               <w:rPr>
                 <w:noProof/>
               </w:rPr>
-              <w:t xml:space="preserve">Cycle count +10% (test)</w:t>
+              <w:t xml:space="preserve">Cycle count −10% (test)</w:t>
             </w:r>
           </w:p>
         </w:tc>
@@ -20308,25 +20324,25 @@
               <w:rPr>
                 <w:noProof/>
               </w:rPr>
-              <w:t xml:space="preserve">1.449</w:t>
-            </w:r>
-          </w:p>
-        </w:tc>
-        <w:tc>
-          <w:tcPr>
-            <w:tcBorders/>
-            <w:vAlign w:val="center"/>
-          </w:tcPr>
-          <w:p>
-            <w:pPr>
-              <w:pStyle w:val="TableText"/>
-              <w:jc w:val="right"/>
-            </w:pPr>
-            <w:r>
-              <w:rPr>
-                <w:noProof/>
-              </w:rPr>
-              <w:t xml:space="preserve">1.497</w:t>
+              <w:t xml:space="preserve">1.421</w:t>
+            </w:r>
+          </w:p>
+        </w:tc>
+        <w:tc>
+          <w:tcPr>
+            <w:tcBorders/>
+            <w:vAlign w:val="center"/>
+          </w:tcPr>
+          <w:p>
+            <w:pPr>
+              <w:pStyle w:val="TableText"/>
+              <w:jc w:val="right"/>
+            </w:pPr>
+            <w:r>
+              <w:rPr>
+                <w:noProof/>
+              </w:rPr>
+              <w:t xml:space="preserve">1.538</w:t>
             </w:r>
           </w:p>
         </w:tc>
@@ -20362,7 +20378,7 @@
               <w:rPr>
                 <w:noProof/>
               </w:rPr>
-              <w:t xml:space="preserve">−0.048</w:t>
+              <w:t xml:space="preserve">−0.117</w:t>
             </w:r>
           </w:p>
         </w:tc>
@@ -20380,7 +20396,7 @@
               <w:rPr>
                 <w:noProof/>
               </w:rPr>
-              <w:t xml:space="preserve">−0.072 to −0.024</w:t>
+              <w:t xml:space="preserve">−0.134 to −0.099</w:t>
             </w:r>
           </w:p>
         </w:tc>
@@ -20416,7 +20432,7 @@
               <w:rPr>
                 <w:noProof/>
               </w:rPr>
-              <w:t xml:space="preserve">43/64</w:t>
+              <w:t xml:space="preserve">59/64</w:t>
             </w:r>
           </w:p>
         </w:tc>
@@ -20439,7 +20455,26 @@
               <w:rPr>
                 <w:noProof/>
               </w:rPr>
-              <w:t xml:space="preserve">Cycle count −10% (test)</w:t>
+              <w:t xml:space="preserve">Matched noise, σ</w:t>
+            </w:r>
+            <w:r>
+              <w:rPr>
+                <w:noProof/>
+                <w:vertAlign w:val="subscript"/>
+              </w:rPr>
+              <w:t xml:space="preserve">noise</w:t>
+            </w:r>
+            <w:r>
+              <w:rPr>
+                <w:noProof/>
+              </w:rPr>
+              <w:t xml:space="preserve"> </w:t>
+            </w:r>
+            <w:r>
+              <w:rPr>
+                <w:noProof/>
+              </w:rPr>
+              <w:t xml:space="preserve">= 1 mV</w:t>
             </w:r>
           </w:p>
         </w:tc>
@@ -20475,25 +20510,25 @@
               <w:rPr>
                 <w:noProof/>
               </w:rPr>
-              <w:t xml:space="preserve">1.477</w:t>
-            </w:r>
-          </w:p>
-        </w:tc>
-        <w:tc>
-          <w:tcPr>
-            <w:tcBorders/>
-            <w:vAlign w:val="center"/>
-          </w:tcPr>
-          <w:p>
-            <w:pPr>
-              <w:pStyle w:val="TableText"/>
-              <w:jc w:val="right"/>
-            </w:pPr>
-            <w:r>
-              <w:rPr>
-                <w:noProof/>
-              </w:rPr>
-              <w:t xml:space="preserve">1.518</w:t>
+              <w:t xml:space="preserve">1.562</w:t>
+            </w:r>
+          </w:p>
+        </w:tc>
+        <w:tc>
+          <w:tcPr>
+            <w:tcBorders/>
+            <w:vAlign w:val="center"/>
+          </w:tcPr>
+          <w:p>
+            <w:pPr>
+              <w:pStyle w:val="TableText"/>
+              <w:jc w:val="right"/>
+            </w:pPr>
+            <w:r>
+              <w:rPr>
+                <w:noProof/>
+              </w:rPr>
+              <w:t xml:space="preserve">1.630</w:t>
             </w:r>
           </w:p>
         </w:tc>
@@ -20529,7 +20564,7 @@
               <w:rPr>
                 <w:noProof/>
               </w:rPr>
-              <w:t xml:space="preserve">−0.041</w:t>
+              <w:t xml:space="preserve">−0.068</w:t>
             </w:r>
           </w:p>
         </w:tc>
@@ -20547,43 +20582,43 @@
               <w:rPr>
                 <w:noProof/>
               </w:rPr>
-              <w:t xml:space="preserve">−0.063 to −0.018</w:t>
-            </w:r>
-          </w:p>
-        </w:tc>
-        <w:tc>
-          <w:tcPr>
-            <w:tcBorders/>
-            <w:vAlign w:val="center"/>
-          </w:tcPr>
-          <w:p>
-            <w:pPr>
-              <w:pStyle w:val="TableText"/>
-              <w:jc w:val="right"/>
-            </w:pPr>
-            <w:r>
-              <w:rPr>
-                <w:noProof/>
-              </w:rPr>
-              <w:t xml:space="preserve">0.002</w:t>
-            </w:r>
-          </w:p>
-        </w:tc>
-        <w:tc>
-          <w:tcPr>
-            <w:tcBorders/>
-            <w:vAlign w:val="center"/>
-          </w:tcPr>
-          <w:p>
-            <w:pPr>
-              <w:pStyle w:val="TableText"/>
-              <w:jc w:val="right"/>
-            </w:pPr>
-            <w:r>
-              <w:rPr>
-                <w:noProof/>
-              </w:rPr>
-              <w:t xml:space="preserve">39/64</w:t>
+              <w:t xml:space="preserve">−0.087 to −0.049</w:t>
+            </w:r>
+          </w:p>
+        </w:tc>
+        <w:tc>
+          <w:tcPr>
+            <w:tcBorders/>
+            <w:vAlign w:val="center"/>
+          </w:tcPr>
+          <w:p>
+            <w:pPr>
+              <w:pStyle w:val="TableText"/>
+              <w:jc w:val="right"/>
+            </w:pPr>
+            <w:r>
+              <w:rPr>
+                <w:noProof/>
+              </w:rPr>
+              <w:t xml:space="preserve">&lt;0.001</w:t>
+            </w:r>
+          </w:p>
+        </w:tc>
+        <w:tc>
+          <w:tcPr>
+            <w:tcBorders/>
+            <w:vAlign w:val="center"/>
+          </w:tcPr>
+          <w:p>
+            <w:pPr>
+              <w:pStyle w:val="TableText"/>
+              <w:jc w:val="right"/>
+            </w:pPr>
+            <w:r>
+              <w:rPr>
+                <w:noProof/>
+              </w:rPr>
+              <w:t xml:space="preserve">54/64</w:t>
             </w:r>
           </w:p>
         </w:tc>
@@ -20625,7 +20660,7 @@
               <w:rPr>
                 <w:noProof/>
               </w:rPr>
-              <w:t xml:space="preserve">= 1 mV</w:t>
+              <w:t xml:space="preserve">= 2 mV</w:t>
             </w:r>
           </w:p>
         </w:tc>
@@ -20661,25 +20696,25 @@
               <w:rPr>
                 <w:noProof/>
               </w:rPr>
-              <w:t xml:space="preserve">1.620</w:t>
-            </w:r>
-          </w:p>
-        </w:tc>
-        <w:tc>
-          <w:tcPr>
-            <w:tcBorders/>
-            <w:vAlign w:val="center"/>
-          </w:tcPr>
-          <w:p>
-            <w:pPr>
-              <w:pStyle w:val="TableText"/>
-              <w:jc w:val="right"/>
-            </w:pPr>
-            <w:r>
-              <w:rPr>
-                <w:noProof/>
-              </w:rPr>
-              <w:t xml:space="preserve">1.678</w:t>
+              <w:t xml:space="preserve">1.700</w:t>
+            </w:r>
+          </w:p>
+        </w:tc>
+        <w:tc>
+          <w:tcPr>
+            <w:tcBorders/>
+            <w:vAlign w:val="center"/>
+          </w:tcPr>
+          <w:p>
+            <w:pPr>
+              <w:pStyle w:val="TableText"/>
+              <w:jc w:val="right"/>
+            </w:pPr>
+            <w:r>
+              <w:rPr>
+                <w:noProof/>
+              </w:rPr>
+              <w:t xml:space="preserve">1.770</w:t>
             </w:r>
           </w:p>
         </w:tc>
@@ -20715,7 +20750,7 @@
               <w:rPr>
                 <w:noProof/>
               </w:rPr>
-              <w:t xml:space="preserve">−0.058</w:t>
+              <w:t xml:space="preserve">−0.070</w:t>
             </w:r>
           </w:p>
         </w:tc>
@@ -20733,7 +20768,7 @@
               <w:rPr>
                 <w:noProof/>
               </w:rPr>
-              <w:t xml:space="preserve">−0.077 to −0.040</w:t>
+              <w:t xml:space="preserve">−0.085 to −0.053</w:t>
             </w:r>
           </w:p>
         </w:tc>
@@ -20769,7 +20804,7 @@
               <w:rPr>
                 <w:noProof/>
               </w:rPr>
-              <w:t xml:space="preserve">50/64</w:t>
+              <w:t xml:space="preserve">57/64</w:t>
             </w:r>
           </w:p>
         </w:tc>
@@ -20792,7 +20827,7 @@
               <w:rPr>
                 <w:noProof/>
               </w:rPr>
-              <w:t xml:space="preserve">Matched noise, σ</w:t>
+              <w:t xml:space="preserve">Test-only noise, σ</w:t>
             </w:r>
             <w:r>
               <w:rPr>
@@ -20811,7 +20846,14 @@
               <w:rPr>
                 <w:noProof/>
               </w:rPr>
-              <w:t xml:space="preserve">= 2 mV</w:t>
+              <w:t xml:space="preserve">= 0.5 mV</w:t>
+            </w:r>
+            <w:r>
+              <w:rPr>
+                <w:noProof/>
+                <w:vertAlign w:val="superscript"/>
+              </w:rPr>
+              <w:t xml:space="preserve">a</w:t>
             </w:r>
           </w:p>
         </w:tc>
@@ -20847,25 +20889,25 @@
               <w:rPr>
                 <w:noProof/>
               </w:rPr>
-              <w:t xml:space="preserve">1.715</w:t>
-            </w:r>
-          </w:p>
-        </w:tc>
-        <w:tc>
-          <w:tcPr>
-            <w:tcBorders/>
-            <w:vAlign w:val="center"/>
-          </w:tcPr>
-          <w:p>
-            <w:pPr>
-              <w:pStyle w:val="TableText"/>
-              <w:jc w:val="right"/>
-            </w:pPr>
-            <w:r>
-              <w:rPr>
-                <w:noProof/>
-              </w:rPr>
-              <w:t xml:space="preserve">1.760</w:t>
+              <w:t xml:space="preserve">3.958</w:t>
+            </w:r>
+          </w:p>
+        </w:tc>
+        <w:tc>
+          <w:tcPr>
+            <w:tcBorders/>
+            <w:vAlign w:val="center"/>
+          </w:tcPr>
+          <w:p>
+            <w:pPr>
+              <w:pStyle w:val="TableText"/>
+              <w:jc w:val="right"/>
+            </w:pPr>
+            <w:r>
+              <w:rPr>
+                <w:noProof/>
+              </w:rPr>
+              <w:t xml:space="preserve">4.339</w:t>
             </w:r>
           </w:p>
         </w:tc>
@@ -20901,7 +20943,7 @@
               <w:rPr>
                 <w:noProof/>
               </w:rPr>
-              <w:t xml:space="preserve">−0.045</w:t>
+              <w:t xml:space="preserve">−0.382</w:t>
             </w:r>
           </w:p>
         </w:tc>
@@ -20919,43 +20961,43 @@
               <w:rPr>
                 <w:noProof/>
               </w:rPr>
-              <w:t xml:space="preserve">−0.069 to −0.022</w:t>
-            </w:r>
-          </w:p>
-        </w:tc>
-        <w:tc>
-          <w:tcPr>
-            <w:tcBorders/>
-            <w:vAlign w:val="center"/>
-          </w:tcPr>
-          <w:p>
-            <w:pPr>
-              <w:pStyle w:val="TableText"/>
-              <w:jc w:val="right"/>
-            </w:pPr>
-            <w:r>
-              <w:rPr>
-                <w:noProof/>
-              </w:rPr>
-              <w:t xml:space="preserve">0.002</w:t>
-            </w:r>
-          </w:p>
-        </w:tc>
-        <w:tc>
-          <w:tcPr>
-            <w:tcBorders/>
-            <w:vAlign w:val="center"/>
-          </w:tcPr>
-          <w:p>
-            <w:pPr>
-              <w:pStyle w:val="TableText"/>
-              <w:jc w:val="right"/>
-            </w:pPr>
-            <w:r>
-              <w:rPr>
-                <w:noProof/>
-              </w:rPr>
-              <w:t xml:space="preserve">46/64</w:t>
+              <w:t xml:space="preserve">—</w:t>
+            </w:r>
+          </w:p>
+        </w:tc>
+        <w:tc>
+          <w:tcPr>
+            <w:tcBorders/>
+            <w:vAlign w:val="center"/>
+          </w:tcPr>
+          <w:p>
+            <w:pPr>
+              <w:pStyle w:val="TableText"/>
+              <w:jc w:val="right"/>
+            </w:pPr>
+            <w:r>
+              <w:rPr>
+                <w:noProof/>
+              </w:rPr>
+              <w:t xml:space="preserve">—</w:t>
+            </w:r>
+          </w:p>
+        </w:tc>
+        <w:tc>
+          <w:tcPr>
+            <w:tcBorders/>
+            <w:vAlign w:val="center"/>
+          </w:tcPr>
+          <w:p>
+            <w:pPr>
+              <w:pStyle w:val="TableText"/>
+              <w:jc w:val="right"/>
+            </w:pPr>
+            <w:r>
+              <w:rPr>
+                <w:noProof/>
+              </w:rPr>
+              <w:t xml:space="preserve">64/64</w:t>
             </w:r>
           </w:p>
         </w:tc>
@@ -20978,33 +21020,7 @@
               <w:rPr>
                 <w:noProof/>
               </w:rPr>
-              <w:t xml:space="preserve">Test-only noise, σ</w:t>
-            </w:r>
-            <w:r>
-              <w:rPr>
-                <w:noProof/>
-                <w:vertAlign w:val="subscript"/>
-              </w:rPr>
-              <w:t xml:space="preserve">noise</w:t>
-            </w:r>
-            <w:r>
-              <w:rPr>
-                <w:noProof/>
-              </w:rPr>
-              <w:t xml:space="preserve"> </w:t>
-            </w:r>
-            <w:r>
-              <w:rPr>
-                <w:noProof/>
-              </w:rPr>
-              <w:t xml:space="preserve">= 0.5 mV</w:t>
-            </w:r>
-            <w:r>
-              <w:rPr>
-                <w:noProof/>
-                <w:vertAlign w:val="superscript"/>
-              </w:rPr>
-              <w:t xml:space="preserve">a</w:t>
+              <w:t xml:space="preserve">Three charge pulses</w:t>
             </w:r>
           </w:p>
         </w:tc>
@@ -21040,25 +21056,25 @@
               <w:rPr>
                 <w:noProof/>
               </w:rPr>
-              <w:t xml:space="preserve">4.374</w:t>
-            </w:r>
-          </w:p>
-        </w:tc>
-        <w:tc>
-          <w:tcPr>
-            <w:tcBorders/>
-            <w:vAlign w:val="center"/>
-          </w:tcPr>
-          <w:p>
-            <w:pPr>
-              <w:pStyle w:val="TableText"/>
-              <w:jc w:val="right"/>
-            </w:pPr>
-            <w:r>
-              <w:rPr>
-                <w:noProof/>
-              </w:rPr>
-              <w:t xml:space="preserve">4.595</w:t>
+              <w:t xml:space="preserve">1.379</w:t>
+            </w:r>
+          </w:p>
+        </w:tc>
+        <w:tc>
+          <w:tcPr>
+            <w:tcBorders/>
+            <w:vAlign w:val="center"/>
+          </w:tcPr>
+          <w:p>
+            <w:pPr>
+              <w:pStyle w:val="TableText"/>
+              <w:jc w:val="right"/>
+            </w:pPr>
+            <w:r>
+              <w:rPr>
+                <w:noProof/>
+              </w:rPr>
+              <w:t xml:space="preserve">1.503</w:t>
             </w:r>
           </w:p>
         </w:tc>
@@ -21094,7 +21110,7 @@
               <w:rPr>
                 <w:noProof/>
               </w:rPr>
-              <w:t xml:space="preserve">—</w:t>
+              <w:t xml:space="preserve">−0.125</w:t>
             </w:r>
           </w:p>
         </w:tc>
@@ -21112,43 +21128,43 @@
               <w:rPr>
                 <w:noProof/>
               </w:rPr>
-              <w:t xml:space="preserve">—</w:t>
-            </w:r>
-          </w:p>
-        </w:tc>
-        <w:tc>
-          <w:tcPr>
-            <w:tcBorders/>
-            <w:vAlign w:val="center"/>
-          </w:tcPr>
-          <w:p>
-            <w:pPr>
-              <w:pStyle w:val="TableText"/>
-              <w:jc w:val="right"/>
-            </w:pPr>
-            <w:r>
-              <w:rPr>
-                <w:noProof/>
-              </w:rPr>
-              <w:t xml:space="preserve">—</w:t>
-            </w:r>
-          </w:p>
-        </w:tc>
-        <w:tc>
-          <w:tcPr>
-            <w:tcBorders/>
-            <w:vAlign w:val="center"/>
-          </w:tcPr>
-          <w:p>
-            <w:pPr>
-              <w:pStyle w:val="TableText"/>
-              <w:jc w:val="right"/>
-            </w:pPr>
-            <w:r>
-              <w:rPr>
-                <w:noProof/>
-              </w:rPr>
-              <w:t xml:space="preserve">—</w:t>
+              <w:t xml:space="preserve">−0.149 to −0.101</w:t>
+            </w:r>
+          </w:p>
+        </w:tc>
+        <w:tc>
+          <w:tcPr>
+            <w:tcBorders/>
+            <w:vAlign w:val="center"/>
+          </w:tcPr>
+          <w:p>
+            <w:pPr>
+              <w:pStyle w:val="TableText"/>
+              <w:jc w:val="right"/>
+            </w:pPr>
+            <w:r>
+              <w:rPr>
+                <w:noProof/>
+              </w:rPr>
+              <w:t xml:space="preserve">&lt;0.001</w:t>
+            </w:r>
+          </w:p>
+        </w:tc>
+        <w:tc>
+          <w:tcPr>
+            <w:tcBorders/>
+            <w:vAlign w:val="center"/>
+          </w:tcPr>
+          <w:p>
+            <w:pPr>
+              <w:pStyle w:val="TableText"/>
+              <w:jc w:val="right"/>
+            </w:pPr>
+            <w:r>
+              <w:rPr>
+                <w:noProof/>
+              </w:rPr>
+              <w:t xml:space="preserve">56/64</w:t>
             </w:r>
           </w:p>
         </w:tc>
@@ -21171,14 +21187,7 @@
               <w:rPr>
                 <w:noProof/>
               </w:rPr>
-              <w:t xml:space="preserve">Five-fold, original implementation</w:t>
-            </w:r>
-            <w:r>
-              <w:rPr>
-                <w:noProof/>
-                <w:vertAlign w:val="superscript"/>
-              </w:rPr>
-              <w:t xml:space="preserve">b</w:t>
+              <w:t xml:space="preserve">Three discharge pulses</w:t>
             </w:r>
           </w:p>
         </w:tc>
@@ -21196,79 +21205,79 @@
               <w:rPr>
                 <w:noProof/>
               </w:rPr>
-              <w:t xml:space="preserve">NMC</w:t>
-            </w:r>
-          </w:p>
-        </w:tc>
-        <w:tc>
-          <w:tcPr>
-            <w:tcBorders/>
-            <w:vAlign w:val="center"/>
-          </w:tcPr>
-          <w:p>
-            <w:pPr>
-              <w:pStyle w:val="TableText"/>
-              <w:jc w:val="right"/>
-            </w:pPr>
-            <w:r>
-              <w:rPr>
-                <w:noProof/>
-              </w:rPr>
-              <w:t xml:space="preserve">1.968</w:t>
-            </w:r>
-          </w:p>
-        </w:tc>
-        <w:tc>
-          <w:tcPr>
-            <w:tcBorders/>
-            <w:vAlign w:val="center"/>
-          </w:tcPr>
-          <w:p>
-            <w:pPr>
-              <w:pStyle w:val="TableText"/>
-              <w:jc w:val="right"/>
-            </w:pPr>
-            <w:r>
-              <w:rPr>
-                <w:noProof/>
-              </w:rPr>
-              <w:t xml:space="preserve">2.132</w:t>
-            </w:r>
-          </w:p>
-        </w:tc>
-        <w:tc>
-          <w:tcPr>
-            <w:tcBorders/>
-            <w:vAlign w:val="center"/>
-          </w:tcPr>
-          <w:p>
-            <w:pPr>
-              <w:pStyle w:val="TableText"/>
-              <w:jc w:val="right"/>
-            </w:pPr>
-            <w:r>
-              <w:rPr>
-                <w:noProof/>
-              </w:rPr>
-              <w:t xml:space="preserve">2.468</w:t>
-            </w:r>
-          </w:p>
-        </w:tc>
-        <w:tc>
-          <w:tcPr>
-            <w:tcBorders/>
-            <w:vAlign w:val="center"/>
-          </w:tcPr>
-          <w:p>
-            <w:pPr>
-              <w:pStyle w:val="TableText"/>
-              <w:jc w:val="right"/>
-            </w:pPr>
-            <w:r>
-              <w:rPr>
-                <w:noProof/>
-              </w:rPr>
-              <w:t xml:space="preserve">−0.163</w:t>
+              <w:t xml:space="preserve">LFP</w:t>
+            </w:r>
+          </w:p>
+        </w:tc>
+        <w:tc>
+          <w:tcPr>
+            <w:tcBorders/>
+            <w:vAlign w:val="center"/>
+          </w:tcPr>
+          <w:p>
+            <w:pPr>
+              <w:pStyle w:val="TableText"/>
+              <w:jc w:val="right"/>
+            </w:pPr>
+            <w:r>
+              <w:rPr>
+                <w:noProof/>
+              </w:rPr>
+              <w:t xml:space="preserve">1.415</w:t>
+            </w:r>
+          </w:p>
+        </w:tc>
+        <w:tc>
+          <w:tcPr>
+            <w:tcBorders/>
+            <w:vAlign w:val="center"/>
+          </w:tcPr>
+          <w:p>
+            <w:pPr>
+              <w:pStyle w:val="TableText"/>
+              <w:jc w:val="right"/>
+            </w:pPr>
+            <w:r>
+              <w:rPr>
+                <w:noProof/>
+              </w:rPr>
+              <w:t xml:space="preserve">1.531</w:t>
+            </w:r>
+          </w:p>
+        </w:tc>
+        <w:tc>
+          <w:tcPr>
+            <w:tcBorders/>
+            <w:vAlign w:val="center"/>
+          </w:tcPr>
+          <w:p>
+            <w:pPr>
+              <w:pStyle w:val="TableText"/>
+              <w:jc w:val="right"/>
+            </w:pPr>
+            <w:r>
+              <w:rPr>
+                <w:noProof/>
+              </w:rPr>
+              <w:t xml:space="preserve">—</w:t>
+            </w:r>
+          </w:p>
+        </w:tc>
+        <w:tc>
+          <w:tcPr>
+            <w:tcBorders/>
+            <w:vAlign w:val="center"/>
+          </w:tcPr>
+          <w:p>
+            <w:pPr>
+              <w:pStyle w:val="TableText"/>
+              <w:jc w:val="right"/>
+            </w:pPr>
+            <w:r>
+              <w:rPr>
+                <w:noProof/>
+              </w:rPr>
+              <w:t xml:space="preserve">−0.116</w:t>
             </w:r>
           </w:p>
         </w:tc>
@@ -21286,50 +21295,43 @@
               <w:rPr>
                 <w:noProof/>
               </w:rPr>
-              <w:t xml:space="preserve">to be added</w:t>
-            </w:r>
-          </w:p>
-        </w:tc>
-        <w:tc>
-          <w:tcPr>
-            <w:tcBorders/>
-            <w:vAlign w:val="center"/>
-          </w:tcPr>
-          <w:p>
-            <w:pPr>
-              <w:pStyle w:val="TableText"/>
-              <w:jc w:val="right"/>
-            </w:pPr>
-            <w:r>
-              <w:rPr>
-                <w:noProof/>
-              </w:rPr>
-              <w:t xml:space="preserve">0.0004</w:t>
-            </w:r>
-            <w:r>
-              <w:rPr>
-                <w:noProof/>
-                <w:vertAlign w:val="superscript"/>
-              </w:rPr>
-              <w:t xml:space="preserve">c</w:t>
-            </w:r>
-          </w:p>
-        </w:tc>
-        <w:tc>
-          <w:tcPr>
-            <w:tcBorders/>
-            <w:vAlign w:val="center"/>
-          </w:tcPr>
-          <w:p>
-            <w:pPr>
-              <w:pStyle w:val="TableText"/>
-              <w:jc w:val="right"/>
-            </w:pPr>
-            <w:r>
-              <w:rPr>
-                <w:noProof/>
-              </w:rPr>
-              <w:t xml:space="preserve">39/44</w:t>
+              <w:t xml:space="preserve">−0.134 to −0.098</w:t>
+            </w:r>
+          </w:p>
+        </w:tc>
+        <w:tc>
+          <w:tcPr>
+            <w:tcBorders/>
+            <w:vAlign w:val="center"/>
+          </w:tcPr>
+          <w:p>
+            <w:pPr>
+              <w:pStyle w:val="TableText"/>
+              <w:jc w:val="right"/>
+            </w:pPr>
+            <w:r>
+              <w:rPr>
+                <w:noProof/>
+              </w:rPr>
+              <w:t xml:space="preserve">&lt;0.001</w:t>
+            </w:r>
+          </w:p>
+        </w:tc>
+        <w:tc>
+          <w:tcPr>
+            <w:tcBorders/>
+            <w:vAlign w:val="center"/>
+          </w:tcPr>
+          <w:p>
+            <w:pPr>
+              <w:pStyle w:val="TableText"/>
+              <w:jc w:val="right"/>
+            </w:pPr>
+            <w:r>
+              <w:rPr>
+                <w:noProof/>
+              </w:rPr>
+              <w:t xml:space="preserve">60/64</w:t>
             </w:r>
           </w:p>
         </w:tc>
@@ -21340,173 +21342,6 @@
         </w:trPr>
         <w:tc>
           <w:tcPr>
-            <w:tcBorders/>
-            <w:vAlign w:val="center"/>
-          </w:tcPr>
-          <w:p>
-            <w:pPr>
-              <w:pStyle w:val="TableText"/>
-              <w:jc w:val="left"/>
-            </w:pPr>
-            <w:r>
-              <w:rPr>
-                <w:noProof/>
-              </w:rPr>
-              <w:t xml:space="preserve">Five-fold, re-implementation</w:t>
-            </w:r>
-          </w:p>
-        </w:tc>
-        <w:tc>
-          <w:tcPr>
-            <w:tcBorders/>
-            <w:vAlign w:val="center"/>
-          </w:tcPr>
-          <w:p>
-            <w:pPr>
-              <w:pStyle w:val="TableText"/>
-              <w:jc w:val="left"/>
-            </w:pPr>
-            <w:r>
-              <w:rPr>
-                <w:noProof/>
-              </w:rPr>
-              <w:t xml:space="preserve">NMC</w:t>
-            </w:r>
-          </w:p>
-        </w:tc>
-        <w:tc>
-          <w:tcPr>
-            <w:tcBorders/>
-            <w:vAlign w:val="center"/>
-          </w:tcPr>
-          <w:p>
-            <w:pPr>
-              <w:pStyle w:val="TableText"/>
-              <w:jc w:val="right"/>
-            </w:pPr>
-            <w:r>
-              <w:rPr>
-                <w:noProof/>
-              </w:rPr>
-              <w:t xml:space="preserve">2.030</w:t>
-            </w:r>
-          </w:p>
-        </w:tc>
-        <w:tc>
-          <w:tcPr>
-            <w:tcBorders/>
-            <w:vAlign w:val="center"/>
-          </w:tcPr>
-          <w:p>
-            <w:pPr>
-              <w:pStyle w:val="TableText"/>
-              <w:jc w:val="right"/>
-            </w:pPr>
-            <w:r>
-              <w:rPr>
-                <w:noProof/>
-              </w:rPr>
-              <w:t xml:space="preserve">2.026</w:t>
-            </w:r>
-          </w:p>
-        </w:tc>
-        <w:tc>
-          <w:tcPr>
-            <w:tcBorders/>
-            <w:vAlign w:val="center"/>
-          </w:tcPr>
-          <w:p>
-            <w:pPr>
-              <w:pStyle w:val="TableText"/>
-              <w:jc w:val="right"/>
-            </w:pPr>
-            <w:r>
-              <w:rPr>
-                <w:noProof/>
-              </w:rPr>
-              <w:t xml:space="preserve">2.317</w:t>
-            </w:r>
-          </w:p>
-        </w:tc>
-        <w:tc>
-          <w:tcPr>
-            <w:tcBorders/>
-            <w:vAlign w:val="center"/>
-          </w:tcPr>
-          <w:p>
-            <w:pPr>
-              <w:pStyle w:val="TableText"/>
-              <w:jc w:val="right"/>
-            </w:pPr>
-            <w:r>
-              <w:rPr>
-                <w:noProof/>
-              </w:rPr>
-              <w:t xml:space="preserve">+0.004</w:t>
-            </w:r>
-          </w:p>
-        </w:tc>
-        <w:tc>
-          <w:tcPr>
-            <w:tcBorders/>
-            <w:vAlign w:val="center"/>
-          </w:tcPr>
-          <w:p>
-            <w:pPr>
-              <w:pStyle w:val="TableText"/>
-              <w:jc w:val="left"/>
-            </w:pPr>
-            <w:r>
-              <w:rPr>
-                <w:noProof/>
-              </w:rPr>
-              <w:t xml:space="preserve">−0.042 to 0.047</w:t>
-            </w:r>
-          </w:p>
-        </w:tc>
-        <w:tc>
-          <w:tcPr>
-            <w:tcBorders/>
-            <w:vAlign w:val="center"/>
-          </w:tcPr>
-          <w:p>
-            <w:pPr>
-              <w:pStyle w:val="TableText"/>
-              <w:jc w:val="right"/>
-            </w:pPr>
-            <w:r>
-              <w:rPr>
-                <w:noProof/>
-              </w:rPr>
-              <w:t xml:space="preserve">0.90</w:t>
-            </w:r>
-          </w:p>
-        </w:tc>
-        <w:tc>
-          <w:tcPr>
-            <w:tcBorders/>
-            <w:vAlign w:val="center"/>
-          </w:tcPr>
-          <w:p>
-            <w:pPr>
-              <w:pStyle w:val="TableText"/>
-              <w:jc w:val="right"/>
-            </w:pPr>
-            <w:r>
-              <w:rPr>
-                <w:noProof/>
-              </w:rPr>
-              <w:t xml:space="preserve">21/44</w:t>
-            </w:r>
-          </w:p>
-        </w:tc>
-      </w:tr>
-      <w:tr>
-        <w:trPr>
-          <w:cantSplit/>
-        </w:trPr>
-        <w:tc>
-          <w:tcPr>
             <w:tcBorders>
               <w:bottom w:val="single" w:sz="12" w:space="0" w:color="000000"/>
             </w:tcBorders>
@@ -21521,7 +21356,14 @@
               <w:rPr>
                 <w:noProof/>
               </w:rPr>
-              <w:t xml:space="preserve">Five-fold, re-implementation, primary branch without absolute-level features</w:t>
+              <w:t xml:space="preserve">Five-fold</w:t>
+            </w:r>
+            <w:r>
+              <w:rPr>
+                <w:noProof/>
+                <w:vertAlign w:val="superscript"/>
+              </w:rPr>
+              <w:t xml:space="preserve">b</w:t>
             </w:r>
           </w:p>
         </w:tc>
@@ -21561,7 +21403,7 @@
               <w:rPr>
                 <w:noProof/>
               </w:rPr>
-              <w:t xml:space="preserve">1.940</w:t>
+              <w:t xml:space="preserve">1.968</w:t>
             </w:r>
           </w:p>
         </w:tc>
@@ -21581,7 +21423,7 @@
               <w:rPr>
                 <w:noProof/>
               </w:rPr>
-              <w:t xml:space="preserve">2.098</w:t>
+              <w:t xml:space="preserve">2.132</w:t>
             </w:r>
           </w:p>
         </w:tc>
@@ -21601,7 +21443,7 @@
               <w:rPr>
                 <w:noProof/>
               </w:rPr>
-              <w:t xml:space="preserve">—</w:t>
+              <w:t xml:space="preserve">2.468</w:t>
             </w:r>
           </w:p>
         </w:tc>
@@ -21621,7 +21463,7 @@
               <w:rPr>
                 <w:noProof/>
               </w:rPr>
-              <w:t xml:space="preserve">−0.158</w:t>
+              <w:t xml:space="preserve">−0.163</w:t>
             </w:r>
           </w:p>
         </w:tc>
@@ -21641,7 +21483,7 @@
               <w:rPr>
                 <w:noProof/>
               </w:rPr>
-              <w:t xml:space="preserve">−0.205 to −0.112</w:t>
+              <w:t xml:space="preserve">−0.204 to −0.125</w:t>
             </w:r>
           </w:p>
         </w:tc>
@@ -21681,7 +21523,7 @@
               <w:rPr>
                 <w:noProof/>
               </w:rPr>
-              <w:t xml:space="preserve">36/44</w:t>
+              <w:t xml:space="preserve">39/44</w:t>
             </w:r>
           </w:p>
         </w:tc>
@@ -21707,7 +21549,7 @@
         <w:t xml:space="preserve"> </w:t>
       </w:r>
       <w:r>
-        <w:t xml:space="preserve">Models trained on clean data with noise added to the test voltages only.</w:t>
+        <w:t xml:space="preserve">Models trained on clean data with noise added to the test voltages only. Pulse subsets use the models trained on all six pulses.</w:t>
       </w:r>
       <w:r>
         <w:t xml:space="preserve"> </w:t>
@@ -21722,22 +21564,570 @@
         <w:t xml:space="preserve"> </w:t>
       </w:r>
       <w:r>
-        <w:t xml:space="preserve">Original implementation; DCIR added to the A1 input (Supplementary Note S4).</w:t>
+        <w:t xml:space="preserve">DCIR added to the A1 input (Supplementary Note S4). Group-level leave-one-group-out errors are shown in Fig. 7a of the main text.</w:t>
+      </w:r>
+    </w:p>
+    <w:p>
+      <w:pPr>
+        <w:pStyle w:val="TableCaption"/>
+      </w:pPr>
+      <w:r>
+        <w:rPr>
+          <w:b/>
+        </w:rPr>
+        <w:t xml:space="preserve">Supplementary Table S7. </w:t>
+      </w:r>
+      <w:r>
+        <w:rPr/>
+        <w:t xml:space="preserve">3 × 5 encoder matrix on the NMC/graphite dataset (cell-macro RMSE, SOH pp; rank within each primary-branch encoder in parentheses).</w:t>
+      </w:r>
+    </w:p>
+    <w:tbl>
+      <w:tblPr>
+        <w:tblW w:type="pct" w:w="5000"/>
+        <w:jc w:val="center"/>
+        <w:tblLayout w:type="fixed"/>
+        <w:tblCellMar>
+          <w:top w:w="15" w:type="dxa"/>
+          <w:left w:w="60" w:type="dxa"/>
+          <w:bottom w:w="15" w:type="dxa"/>
+          <w:right w:w="60" w:type="dxa"/>
+        </w:tblCellMar>
+        <w:tblCaption w:val="Supplementary Table S7. 3 × 5 encoder matrix on the NMC/graphite dataset (cell-macro RMSE, SOH pp; rank within each primary-branch encoder in parentheses)."/>
+      </w:tblPr>
+      <w:tblGrid>
+        <w:gridCol w:w="2262"/>
+        <w:gridCol w:w="1131"/>
+        <w:gridCol w:w="1131"/>
+        <w:gridCol w:w="1131"/>
+        <w:gridCol w:w="1131"/>
+        <w:gridCol w:w="1131"/>
+      </w:tblGrid>
+      <w:tr>
+        <w:trPr>
+          <w:tblHeader w:val="true"/>
+          <w:cantSplit/>
+        </w:trPr>
+        <w:tc>
+          <w:tcPr>
+            <w:tcBorders>
+              <w:top w:val="single" w:sz="12" w:space="0" w:color="000000"/>
+              <w:bottom w:val="single" w:sz="6" w:space="0" w:color="000000"/>
+            </w:tcBorders>
+            <w:vAlign w:val="center"/>
+          </w:tcPr>
+          <w:p>
+            <w:pPr>
+              <w:pStyle w:val="TableText"/>
+              <w:jc w:val="left"/>
+            </w:pPr>
+            <w:r>
+              <w:rPr>
+                <w:b/>
+                <w:noProof/>
+              </w:rPr>
+              <w:t xml:space="preserve">Primary branch</w:t>
+            </w:r>
+          </w:p>
+        </w:tc>
+        <w:tc>
+          <w:tcPr>
+            <w:tcBorders>
+              <w:top w:val="single" w:sz="12" w:space="0" w:color="000000"/>
+              <w:bottom w:val="single" w:sz="6" w:space="0" w:color="000000"/>
+            </w:tcBorders>
+            <w:vAlign w:val="center"/>
+          </w:tcPr>
+          <w:p>
+            <w:pPr>
+              <w:pStyle w:val="TableText"/>
+              <w:jc w:val="right"/>
+            </w:pPr>
+            <w:r>
+              <w:rPr>
+                <w:b/>
+                <w:noProof/>
+              </w:rPr>
+              <w:t xml:space="preserve">CNN</w:t>
+            </w:r>
+          </w:p>
+        </w:tc>
+        <w:tc>
+          <w:tcPr>
+            <w:tcBorders>
+              <w:top w:val="single" w:sz="12" w:space="0" w:color="000000"/>
+              <w:bottom w:val="single" w:sz="6" w:space="0" w:color="000000"/>
+            </w:tcBorders>
+            <w:vAlign w:val="center"/>
+          </w:tcPr>
+          <w:p>
+            <w:pPr>
+              <w:pStyle w:val="TableText"/>
+              <w:jc w:val="right"/>
+            </w:pPr>
+            <w:r>
+              <w:rPr>
+                <w:b/>
+                <w:noProof/>
+              </w:rPr>
+              <w:t xml:space="preserve">MLP</w:t>
+            </w:r>
+          </w:p>
+        </w:tc>
+        <w:tc>
+          <w:tcPr>
+            <w:tcBorders>
+              <w:top w:val="single" w:sz="12" w:space="0" w:color="000000"/>
+              <w:bottom w:val="single" w:sz="6" w:space="0" w:color="000000"/>
+            </w:tcBorders>
+            <w:vAlign w:val="center"/>
+          </w:tcPr>
+          <w:p>
+            <w:pPr>
+              <w:pStyle w:val="TableText"/>
+              <w:jc w:val="right"/>
+            </w:pPr>
+            <w:r>
+              <w:rPr>
+                <w:b/>
+                <w:noProof/>
+              </w:rPr>
+              <w:t xml:space="preserve">TCN</w:t>
+            </w:r>
+          </w:p>
+        </w:tc>
+        <w:tc>
+          <w:tcPr>
+            <w:tcBorders>
+              <w:top w:val="single" w:sz="12" w:space="0" w:color="000000"/>
+              <w:bottom w:val="single" w:sz="6" w:space="0" w:color="000000"/>
+            </w:tcBorders>
+            <w:vAlign w:val="center"/>
+          </w:tcPr>
+          <w:p>
+            <w:pPr>
+              <w:pStyle w:val="TableText"/>
+              <w:jc w:val="right"/>
+            </w:pPr>
+            <w:r>
+              <w:rPr>
+                <w:b/>
+                <w:noProof/>
+              </w:rPr>
+              <w:t xml:space="preserve">PW-Transformer</w:t>
+            </w:r>
+          </w:p>
+        </w:tc>
+        <w:tc>
+          <w:tcPr>
+            <w:tcBorders>
+              <w:top w:val="single" w:sz="12" w:space="0" w:color="000000"/>
+              <w:bottom w:val="single" w:sz="6" w:space="0" w:color="000000"/>
+            </w:tcBorders>
+            <w:vAlign w:val="center"/>
+          </w:tcPr>
+          <w:p>
+            <w:pPr>
+              <w:pStyle w:val="TableText"/>
+              <w:jc w:val="right"/>
+            </w:pPr>
+            <w:r>
+              <w:rPr>
+                <w:b/>
+                <w:noProof/>
+              </w:rPr>
+              <w:t xml:space="preserve">PatchTST</w:t>
+            </w:r>
+          </w:p>
+        </w:tc>
+      </w:tr>
+      <w:tr>
+        <w:trPr>
+          <w:cantSplit/>
+        </w:trPr>
+        <w:tc>
+          <w:tcPr>
+            <w:tcBorders/>
+            <w:vAlign w:val="center"/>
+          </w:tcPr>
+          <w:p>
+            <w:pPr>
+              <w:pStyle w:val="TableText"/>
+              <w:jc w:val="left"/>
+            </w:pPr>
+            <w:r>
+              <w:rPr>
+                <w:noProof/>
+              </w:rPr>
+              <w:t xml:space="preserve">MLP</w:t>
+            </w:r>
+          </w:p>
+        </w:tc>
+        <w:tc>
+          <w:tcPr>
+            <w:tcBorders/>
+            <w:vAlign w:val="center"/>
+          </w:tcPr>
+          <w:p>
+            <w:pPr>
+              <w:pStyle w:val="TableText"/>
+              <w:jc w:val="right"/>
+            </w:pPr>
+            <w:r>
+              <w:rPr>
+                <w:noProof/>
+              </w:rPr>
+              <w:t xml:space="preserve">2.035 (5)</w:t>
+            </w:r>
+          </w:p>
+        </w:tc>
+        <w:tc>
+          <w:tcPr>
+            <w:tcBorders/>
+            <w:vAlign w:val="center"/>
+          </w:tcPr>
+          <w:p>
+            <w:pPr>
+              <w:pStyle w:val="TableText"/>
+              <w:jc w:val="right"/>
+            </w:pPr>
+            <w:r>
+              <w:rPr>
+                <w:noProof/>
+              </w:rPr>
+              <w:t xml:space="preserve">1.966 (3)</w:t>
+            </w:r>
+          </w:p>
+        </w:tc>
+        <w:tc>
+          <w:tcPr>
+            <w:tcBorders/>
+            <w:vAlign w:val="center"/>
+          </w:tcPr>
+          <w:p>
+            <w:pPr>
+              <w:pStyle w:val="TableText"/>
+              <w:jc w:val="right"/>
+            </w:pPr>
+            <w:r>
+              <w:rPr>
+                <w:noProof/>
+              </w:rPr>
+              <w:t xml:space="preserve">1.953 (2)</w:t>
+            </w:r>
+          </w:p>
+        </w:tc>
+        <w:tc>
+          <w:tcPr>
+            <w:tcBorders/>
+            <w:vAlign w:val="center"/>
+          </w:tcPr>
+          <w:p>
+            <w:pPr>
+              <w:pStyle w:val="TableText"/>
+              <w:jc w:val="right"/>
+            </w:pPr>
+            <w:r>
+              <w:rPr>
+                <w:noProof/>
+              </w:rPr>
+              <w:t xml:space="preserve">1.903 (1)</w:t>
+            </w:r>
+          </w:p>
+        </w:tc>
+        <w:tc>
+          <w:tcPr>
+            <w:tcBorders/>
+            <w:vAlign w:val="center"/>
+          </w:tcPr>
+          <w:p>
+            <w:pPr>
+              <w:pStyle w:val="TableText"/>
+              <w:jc w:val="right"/>
+            </w:pPr>
+            <w:r>
+              <w:rPr>
+                <w:noProof/>
+              </w:rPr>
+              <w:t xml:space="preserve">1.968 (4)</w:t>
+            </w:r>
+          </w:p>
+        </w:tc>
+      </w:tr>
+      <w:tr>
+        <w:trPr>
+          <w:cantSplit/>
+        </w:trPr>
+        <w:tc>
+          <w:tcPr>
+            <w:tcBorders/>
+            <w:vAlign w:val="center"/>
+          </w:tcPr>
+          <w:p>
+            <w:pPr>
+              <w:pStyle w:val="TableText"/>
+              <w:jc w:val="left"/>
+            </w:pPr>
+            <w:r>
+              <w:rPr>
+                <w:noProof/>
+              </w:rPr>
+              <w:t xml:space="preserve">ResNet</w:t>
+            </w:r>
+          </w:p>
+        </w:tc>
+        <w:tc>
+          <w:tcPr>
+            <w:tcBorders/>
+            <w:vAlign w:val="center"/>
+          </w:tcPr>
+          <w:p>
+            <w:pPr>
+              <w:pStyle w:val="TableText"/>
+              <w:jc w:val="right"/>
+            </w:pPr>
+            <w:r>
+              <w:rPr>
+                <w:noProof/>
+              </w:rPr>
+              <w:t xml:space="preserve">2.005 (5)</w:t>
+            </w:r>
+          </w:p>
+        </w:tc>
+        <w:tc>
+          <w:tcPr>
+            <w:tcBorders/>
+            <w:vAlign w:val="center"/>
+          </w:tcPr>
+          <w:p>
+            <w:pPr>
+              <w:pStyle w:val="TableText"/>
+              <w:jc w:val="right"/>
+            </w:pPr>
+            <w:r>
+              <w:rPr>
+                <w:noProof/>
+              </w:rPr>
+              <w:t xml:space="preserve">1.863 (1)</w:t>
+            </w:r>
+          </w:p>
+        </w:tc>
+        <w:tc>
+          <w:tcPr>
+            <w:tcBorders/>
+            <w:vAlign w:val="center"/>
+          </w:tcPr>
+          <w:p>
+            <w:pPr>
+              <w:pStyle w:val="TableText"/>
+              <w:jc w:val="right"/>
+            </w:pPr>
+            <w:r>
+              <w:rPr>
+                <w:noProof/>
+              </w:rPr>
+              <w:t xml:space="preserve">1.900 (2)</w:t>
+            </w:r>
+          </w:p>
+        </w:tc>
+        <w:tc>
+          <w:tcPr>
+            <w:tcBorders/>
+            <w:vAlign w:val="center"/>
+          </w:tcPr>
+          <w:p>
+            <w:pPr>
+              <w:pStyle w:val="TableText"/>
+              <w:jc w:val="right"/>
+            </w:pPr>
+            <w:r>
+              <w:rPr>
+                <w:noProof/>
+              </w:rPr>
+              <w:t xml:space="preserve">1.994 (4)</w:t>
+            </w:r>
+          </w:p>
+        </w:tc>
+        <w:tc>
+          <w:tcPr>
+            <w:tcBorders/>
+            <w:vAlign w:val="center"/>
+          </w:tcPr>
+          <w:p>
+            <w:pPr>
+              <w:pStyle w:val="TableText"/>
+              <w:jc w:val="right"/>
+            </w:pPr>
+            <w:r>
+              <w:rPr>
+                <w:noProof/>
+              </w:rPr>
+              <w:t xml:space="preserve">1.908 (3)</w:t>
+            </w:r>
+          </w:p>
+        </w:tc>
+      </w:tr>
+      <w:tr>
+        <w:trPr>
+          <w:cantSplit/>
+        </w:trPr>
+        <w:tc>
+          <w:tcPr>
+            <w:tcBorders>
+              <w:bottom w:val="single" w:sz="12" w:space="0" w:color="000000"/>
+            </w:tcBorders>
+            <w:vAlign w:val="center"/>
+          </w:tcPr>
+          <w:p>
+            <w:pPr>
+              <w:pStyle w:val="TableText"/>
+              <w:jc w:val="left"/>
+            </w:pPr>
+            <w:r>
+              <w:rPr>
+                <w:noProof/>
+              </w:rPr>
+              <w:t xml:space="preserve">FT-Transformer</w:t>
+            </w:r>
+          </w:p>
+        </w:tc>
+        <w:tc>
+          <w:tcPr>
+            <w:tcBorders>
+              <w:bottom w:val="single" w:sz="12" w:space="0" w:color="000000"/>
+            </w:tcBorders>
+            <w:vAlign w:val="center"/>
+          </w:tcPr>
+          <w:p>
+            <w:pPr>
+              <w:pStyle w:val="TableText"/>
+              <w:jc w:val="right"/>
+            </w:pPr>
+            <w:r>
+              <w:rPr>
+                <w:noProof/>
+              </w:rPr>
+              <w:t xml:space="preserve">2.017 (1)</w:t>
+            </w:r>
+          </w:p>
+        </w:tc>
+        <w:tc>
+          <w:tcPr>
+            <w:tcBorders>
+              <w:bottom w:val="single" w:sz="12" w:space="0" w:color="000000"/>
+            </w:tcBorders>
+            <w:vAlign w:val="center"/>
+          </w:tcPr>
+          <w:p>
+            <w:pPr>
+              <w:pStyle w:val="TableText"/>
+              <w:jc w:val="right"/>
+            </w:pPr>
+            <w:r>
+              <w:rPr>
+                <w:noProof/>
+              </w:rPr>
+              <w:t xml:space="preserve">2.166 (3)</w:t>
+            </w:r>
+          </w:p>
+        </w:tc>
+        <w:tc>
+          <w:tcPr>
+            <w:tcBorders>
+              <w:bottom w:val="single" w:sz="12" w:space="0" w:color="000000"/>
+            </w:tcBorders>
+            <w:vAlign w:val="center"/>
+          </w:tcPr>
+          <w:p>
+            <w:pPr>
+              <w:pStyle w:val="TableText"/>
+              <w:jc w:val="right"/>
+            </w:pPr>
+            <w:r>
+              <w:rPr>
+                <w:noProof/>
+              </w:rPr>
+              <w:t xml:space="preserve">2.259 (5)</w:t>
+            </w:r>
+          </w:p>
+        </w:tc>
+        <w:tc>
+          <w:tcPr>
+            <w:tcBorders>
+              <w:bottom w:val="single" w:sz="12" w:space="0" w:color="000000"/>
+            </w:tcBorders>
+            <w:vAlign w:val="center"/>
+          </w:tcPr>
+          <w:p>
+            <w:pPr>
+              <w:pStyle w:val="TableText"/>
+              <w:jc w:val="right"/>
+            </w:pPr>
+            <w:r>
+              <w:rPr>
+                <w:noProof/>
+              </w:rPr>
+              <w:t xml:space="preserve">2.097 (2)</w:t>
+            </w:r>
+          </w:p>
+        </w:tc>
+        <w:tc>
+          <w:tcPr>
+            <w:tcBorders>
+              <w:bottom w:val="single" w:sz="12" w:space="0" w:color="000000"/>
+            </w:tcBorders>
+            <w:vAlign w:val="center"/>
+          </w:tcPr>
+          <w:p>
+            <w:pPr>
+              <w:pStyle w:val="TableText"/>
+              <w:jc w:val="right"/>
+            </w:pPr>
+            <w:r>
+              <w:rPr>
+                <w:noProof/>
+              </w:rPr>
+              <w:t xml:space="preserve">2.169 (4)</w:t>
+            </w:r>
+          </w:p>
+        </w:tc>
+      </w:tr>
+    </w:tbl>
+    <w:p>
+      <w:pPr>
+        <w:pStyle w:val="TableNote"/>
+      </w:pPr>
+      <w:r>
+        <w:t xml:space="preserve">44 cells, five folds × three seeds. Sum-of-squares shares of the between-pairing variation (95% CI, 5,000 fold-stratified cell bootstraps): primary branch 68.8% (48.9–79.9%), supplementary branch 1.8% (0.4–6.1%) and pairing 29.5% (18.1–48.3%); without FT-Transformer 9.2%, 51.0% and 39.8% (24.6–58.6%). Interaction test with seeds as replicates:</w:t>
       </w:r>
       <w:r>
         <w:t xml:space="preserve"> </w:t>
       </w:r>
       <w:r>
         <w:rPr>
-          <w:vertAlign w:val="superscript"/>
+          <w:i/>
+          <w:iCs/>
         </w:rPr>
-        <w:t xml:space="preserve">c</w:t>
+        <w:t xml:space="preserve">F</w:t>
+      </w:r>
+      <w:r>
+        <w:t xml:space="preserve">(8, 30) = 1.74,</w:t>
       </w:r>
       <w:r>
         <w:t xml:space="preserve"> </w:t>
       </w:r>
       <w:r>
-        <w:t xml:space="preserve">Holm-adjusted. Group-level leave-one-group-out errors are shown in Fig. 7a of the main text.</w:t>
+        <w:rPr>
+          <w:i/>
+          <w:iCs/>
+        </w:rPr>
+        <w:t xml:space="preserve">p</w:t>
+      </w:r>
+      <w:r>
+        <w:t xml:space="preserve"> </w:t>
+      </w:r>
+      <w:r>
+        <w:t xml:space="preserve">= 0.13. ResNet + MLP − MLP + PatchTST = −0.105 pp (−0.146 to −0.064; 33/44 cells).</w:t>
       </w:r>
     </w:p>
     <w:bookmarkEnd w:id="25"/>
@@ -21919,7 +22309,7 @@
           <wp:inline>
             <wp:extent cx="5277600" cy="2191876"/>
             <wp:effectExtent b="0" l="0" r="0" t="0"/>
-            <wp:docPr descr="Fig. S3. SOH-dependent mean bias and overall residual distribution of R0 (blue, solid) and GBDT (teal, dashed). Residuals are the seed-averaged prediction minus the measured SOH of each record. Left: 1-pp bins of measured SOH with at least 20 records; shading marks SOH &lt; 80% and ≥ 95%; the inset magnifies 89–97% SOH. Right: kernel density of all 16,938 residuals, normalised to the common maximum." title="" id="33" name="Picture"/>
+            <wp:docPr descr="Fig. S3. SOH-dependent mean bias and overall residual distribution of R0 (blue, solid) and the primary-branch-only model A2 (brown, dashed). Residuals are the seed-averaged prediction minus the measured SOH of each record. Left: 1-pp bins of measured SOH with at least 20 records; shading marks SOH &lt; 80% and ≥ 95%; the inset magnifies 89–97% SOH. Right: kernel density of all 16,938 residuals, normalised to the common maximum." title="" id="33" name="Picture"/>
             <a:graphic>
               <a:graphicData uri="http://schemas.openxmlformats.org/drawingml/2006/picture">
                 <pic:pic>
@@ -21972,7 +22362,7 @@
         <w:t xml:space="preserve"> </w:t>
       </w:r>
       <w:r>
-        <w:t xml:space="preserve">SOH-dependent mean bias and overall residual distribution of R0 (blue, solid) and GBDT (teal, dashed). Residuals are the seed-averaged prediction minus the measured SOH of each record. Left: 1-pp bins of measured SOH with at least 20 records; shading marks SOH &lt; 80% and ≥ 95%; the inset magnifies 89–97% SOH. Right: kernel density of all 16,938 residuals, normalised to the common maximum.</w:t>
+        <w:t xml:space="preserve">SOH-dependent mean bias and overall residual distribution of R0 (blue, solid) and the primary-branch-only model A2 (brown, dashed). Residuals are the seed-averaged prediction minus the measured SOH of each record. Left: 1-pp bins of measured SOH with at least 20 records; shading marks SOH &lt; 80% and ≥ 95%; the inset magnifies 89–97% SOH. Right: kernel density of all 16,938 residuals, normalised to the common maximum.</w:t>
       </w:r>
     </w:p>
     <w:p>

</xml_diff>